<commit_message>
Conform IJRM version to the journal's Guide for Authors (separate highlights/title page, AI declaration, appendices in manuscript)
Co-Authored-By: Claude Sonnet 5.5 <noreply@anthropic.com>
Claude-Session: https://claude.ai/code/session_01HnawjNDnkzMuwTK6W6stpZ
</commit_message>
<xml_diff>
--- a/influencer_submission/ijrm/cover_letter.docx
+++ b/influencer_submission/ijrm/cover_letter.docx
@@ -41,7 +41,7 @@
         <w:pStyle w:val="BodyText"/>
       </w:pPr>
       <w:r>
-        <w:t xml:space="preserve">[I/We] submit</w:t>
+        <w:t xml:space="preserve">Please consider</w:t>
       </w:r>
       <w:r>
         <w:t xml:space="preserve"> </w:t>
@@ -59,20 +59,7 @@
         <w:t xml:space="preserve"> </w:t>
       </w:r>
       <w:r>
-        <w:t xml:space="preserve">for consideration in the</w:t>
-      </w:r>
-      <w:r>
-        <w:t xml:space="preserve"> </w:t>
-      </w:r>
-      <w:r>
-        <w:rPr>
-          <w:iCs/>
-          <w:i/>
-        </w:rPr>
-        <w:t xml:space="preserve">International Journal of Research in Marketing</w:t>
-      </w:r>
-      <w:r>
-        <w:t xml:space="preserve">.</w:t>
+        <w:t xml:space="preserve">for publication in IJRM.</w:t>
       </w:r>
     </w:p>
     <w:p>
@@ -80,7 +67,7 @@
         <w:pStyle w:val="BodyText"/>
       </w:pPr>
       <w:r>
-        <w:t xml:space="preserve">Marketers increasingly pre-test influencer campaigns in agent-based simulators, including simulators with LLM-driven agents, before choosing between a few influencers and many ordinary users. Guidance on agent-based marketing models has focused on specification and validation of the agents. This paper asks whether the recommendation also depends on choices outside the agent model, and finds that it does: the metric used to compare plans, the mechanism that schedules agent actions, and the assumed relation between an account’s audience size and follower attention (an engagement elasticity β) can each create, distort, or reverse the answer.</w:t>
+        <w:t xml:space="preserve">Marketers increasingly pre-test influencer campaigns in agent-based simulators, including those with LLM-driven agents, before choosing between a few influencers and many ordinary users. The marketing literature on such models has focused on specifying and validating the agents. We show that the recommendation also depends on three choices outside the agent model: the metric used to compare plans, the mechanism that schedules agent actions, and the assumed relation between an account’s audience size and follower attention, which we formalize as an engagement elasticity β.</w:t>
       </w:r>
     </w:p>
     <w:p>
@@ -88,7 +75,7 @@
         <w:pStyle w:val="BodyText"/>
       </w:pPr>
       <w:r>
-        <w:t xml:space="preserve">Using an event-driven simulator and decision-theoretic criteria (discounted reach, certainty equivalents, conditional value at risk, stochastic dominance), we find that the scale-versus-speed trade-off suggested by the time to half of a plan’s own adopters is an artifact of normalization; that alternative schedulers roughly double absolute differences between plans; and that the ranking of concentrated and distributed seeding reverses at modest elasticities, with a band in which time and risk preferences decide. We estimate β on 209,890 posts from six influencer campaigns on Weibo (0.66, 95% CI 0.63 to 0.68), well above the reversal thresholds. We state the limits clearly: the simulator is rule-based and not calibrated to trace data, and the elasticity estimate is descriptive and biased upward by known features of the data, so the conclusions are offered as hypotheses for field testing.</w:t>
+        <w:t xml:space="preserve">Using an event-driven simulator and decision-theoretic criteria, we find that the familiar scale-versus-speed trade-off is an artifact of scale-normalized speed metrics, that alternative schedulers roughly double absolute differences between plans, and that the ranking of influencer and grassroots seeding reverses at modest elasticities, with thresholds that a first-generation exposure argument predicts. On 209,890 posts from six Weibo campaigns we estimate β at 0.66 (95% CI 0.63 to 0.68), well above those thresholds. We turn a long-running qualitative debate (influentials versus ordinary users) into an estimable quantity, and we state the limits openly: the simulator is rule-based and uncalibrated, and the estimate is descriptive and biased upward by known features of the data.</w:t>
       </w:r>
     </w:p>
     <w:p>
@@ -96,7 +83,7 @@
         <w:pStyle w:val="BodyText"/>
       </w:pPr>
       <w:r>
-        <w:t xml:space="preserve">We believe the paper fits IJRM’s readership in marketing modeling and analytics and builds on work previously published in the journal on agent-based modeling in marketing (Rand and Rust 2011). The empirical analysis uses a public CC-BY 4.0 dataset (SAGraph), and code and per-run results are provided as an anonymized archive.</w:t>
+        <w:t xml:space="preserve">The paper fits IJRM’s interest in innovative, timely research for marketing scholars and practitioners: it speaks to marketing researchers and agencies that use simulation, extends the agent-based modeling tradition in the journal (Rand and Rust, 2011) to LLM-agent simulators, and offers three concrete principles for pre-tests. It is not a replication or a minor extension; it identifies a new source of error in a fast-growing practice. [AUTHOR TO COMPLETE, optional: Associate Editors or Editorial Review Board members you consider well suited to handle the manuscript.]</w:t>
       </w:r>
     </w:p>
     <w:p>
@@ -104,7 +91,7 @@
         <w:pStyle w:val="BodyText"/>
       </w:pPr>
       <w:r>
-        <w:t xml:space="preserve">The manuscript is not published and is not under review elsewhere. [AUTHOR TO COMPLETE: answer the submission system’s questions on prior submissions accurately; conflicts of interest; funding; suggested and excluded reviewers if requested.]</w:t>
+        <w:t xml:space="preserve">Sincerely,</w:t>
       </w:r>
     </w:p>
     <w:p>
@@ -112,15 +99,7 @@
         <w:pStyle w:val="BodyText"/>
       </w:pPr>
       <w:r>
-        <w:t xml:space="preserve">Sincerely,</w:t>
-      </w:r>
-    </w:p>
-    <w:p>
-      <w:pPr>
-        <w:pStyle w:val="BodyText"/>
-      </w:pPr>
-      <w:r>
-        <w:t xml:space="preserve">[Name, affiliation, e-mail]</w:t>
+        <w:t xml:space="preserve">[Name]</w:t>
       </w:r>
     </w:p>
     <w:sectPr/>

</xml_diff>